<commit_message>
Sandy & Junior: revisão da Parte 5
Co-Authored-By: Claude Opus 5.5 <noreply@anthropic.com>
Claude-Session: https://claude.ai/code/session_01MJjUEEZrxQDEUifKK2vj9g
</commit_message>
<xml_diff>
--- a/roteiros/sandy-junior/SJ_Parte5.docx
+++ b/roteiros/sandy-junior/SJ_Parte5.docx
@@ -39,7 +39,7 @@
         <w:rPr>
           <w:color w:val="000000"/>
         </w:rPr>
-        <w:t>Depois do nascimento do menino, Sandy fez uma escolha que ninguém esperava de alguém que trabalhava desde os seis anos. Diminuiu o ritmo e passou a fazer menos shows.</w:t>
+        <w:t>Depois do nascimento do menino, Sandy fez uma escolha rara para alguém que trabalhava desde os seis anos. Diminuiu o ritmo e passou a fazer menos shows.</w:t>
       </w:r>
     </w:p>
     <w:p>
@@ -117,7 +117,7 @@
     <w:p>
       <w:r>
         <w:rPr>
-          <w:color w:val="1F4EB4"/>
+          <w:color w:val="000000"/>
         </w:rPr>
         <w:t>Sandy teve várias crises de pânico antes de voltar aos palcos com o irmão. Passou dias chorando. Tinha medo de não conseguir subir ao palco.</w:t>
       </w:r>
@@ -125,9 +125,9 @@
     <w:p>
       <w:r>
         <w:rPr>
-          <w:color w:val="1F4EB4"/>
+          <w:color w:val="000000"/>
         </w:rPr>
-        <w:t>E ela guardou isso durante toda a turnê. Só contou anos depois, em dois mil e vinte e três, num podcast. Ninguém na plateia, ninguém entre os milhões de fãs que assistiam, sabia que a mulher cantando sorrindo tinha passado dias em crise antes de pisar ali.</w:t>
+        <w:t>Ela guardou isso do público. Só contou anos depois, em dois mil e vinte e três, num podcast. Ninguém na plateia, ninguém entre os milhões de fãs que assistiam, sabia que a mulher cantando sorrindo tinha passado dias em crise antes de pisar ali.</w:t>
       </w:r>
     </w:p>
     <w:p>
@@ -175,7 +175,7 @@
         <w:rPr>
           <w:color w:val="C00000"/>
         </w:rPr>
-        <w:t>Foi justamente nessa turnê que aconteceu a cena que fecha esta história. A cena que liga a menina de seis anos e o menino de cinco ao casal de adultos que eles se tornaram. Porque, num dos shows, Junior fez uma coisa que ninguém esperava. Fez isso no meio da primeira música que eles cantaram na vida.</w:t>
+        <w:t>Foi justamente nessa turnê que aconteceu a cena que fecha esta história. A cena que liga a menina de seis anos e o menino de cinco aos dois adultos que eles se tornaram. Porque, num dos shows, Junior fez uma coisa que ninguém esperava. Fez isso no meio da primeira música que eles cantaram na vida.</w:t>
       </w:r>
     </w:p>
     <w:p>
@@ -191,7 +191,7 @@
         <w:rPr>
           <w:color w:val="000000"/>
         </w:rPr>
-        <w:t>Lembra que, lá em mil novecentos e oitenta e nove, Junior fazia o papel de Genaro, o marido ciumento, e Sandy fazia Maria Chiquinha, a mulher?</w:t>
+        <w:t>Lá em mil novecentos e oitenta e nove, Junior fazia o papel de Genaro, o marido ciumento. Sandy fazia Maria Chiquinha, a mulher dele.</w:t>
       </w:r>
     </w:p>
     <w:p>
@@ -317,7 +317,7 @@
     <w:p>
       <w:r>
         <w:rPr>
-          <w:color w:val="1F4EB4"/>
+          <w:color w:val="000000"/>
         </w:rPr>
         <w:t>A história não terminou ali. Em agosto de dois mil e vinte e três, Sandy contou num podcast uma decisão que tinha tomado dentro de casa. Ela não deixa o filho, Theo, ouvir Maria Chiquinha. Por causa da letra.</w:t>
       </w:r>
@@ -439,7 +439,7 @@
         <w:rPr>
           <w:color w:val="000000"/>
         </w:rPr>
-        <w:t>A santa, enfim, tinha virado uma mulher comum. Para ela, isso parecia ser um alívio.</w:t>
+        <w:t>A santa, enfim, tinha virado uma mulher comum.</w:t>
       </w:r>
     </w:p>
     <w:p>
@@ -455,7 +455,7 @@
         <w:rPr>
           <w:color w:val="000000"/>
         </w:rPr>
-        <w:t>Em trinta de outubro de dois mil e vinte e três, ele lançou o primeiro disco solo da carreira. Com o próprio nome na capa.</w:t>
+        <w:t>Em trinta de outubro de dois mil e vinte e três, ele lançou o primeiro disco solo da carreira.</w:t>
       </w:r>
     </w:p>
     <w:p>
@@ -567,7 +567,7 @@
         <w:rPr>
           <w:color w:val="000000"/>
         </w:rPr>
-        <w:t>Talvez esse seja o maior preço da fama que começou cedo demais.</w:t>
+        <w:t>Talvez essa seja a lição mais dura de uma fama que começou cedo demais.</w:t>
       </w:r>
     </w:p>
     <w:p>

</xml_diff>

<commit_message>
Sandy & Junior: microgancho extra na Parte 5
Co-Authored-By: Claude Opus 5.5 <noreply@anthropic.com>
Claude-Session: https://claude.ai/code/session_01MJjUEEZrxQDEUifKK2vj9g
</commit_message>
<xml_diff>
--- a/roteiros/sandy-junior/SJ_Parte5.docx
+++ b/roteiros/sandy-junior/SJ_Parte5.docx
@@ -272,6 +272,14 @@
           <w:color w:val="000000"/>
         </w:rPr>
         <w:t>Na época, ninguém problematizava esse tipo de letra.</w:t>
+      </w:r>
+    </w:p>
+    <w:p>
+      <w:r>
+        <w:rPr>
+          <w:color w:val="C00000"/>
+        </w:rPr>
+        <w:t>Trinta anos. Foi o tempo que levou para alguém, finalmente, se recusar a cantar aquilo em voz alta. E esse alguém foi justamente quem tinha cantado aqueles versos pela primeira vez.</w:t>
       </w:r>
     </w:p>
     <w:p>

</xml_diff>